<commit_message>
Update link color to 3F5AA7
</commit_message>
<xml_diff>
--- a/bakery-src/scripts/gdoc/custom-reference-en.docx
+++ b/bakery-src/scripts/gdoc/custom-reference-en.docx
@@ -535,19 +535,7 @@
         <w:rPr>
           <w:rStyle w:val="Hyperlink"/>
         </w:rPr>
-        <w:t>https://openstax.o</w:t>
-      </w:r>
-      <w:r>
-        <w:rPr>
-          <w:rStyle w:val="Hyperlink"/>
-        </w:rPr>
-        <w:t>r</w:t>
-      </w:r>
-      <w:r>
-        <w:rPr>
-          <w:rStyle w:val="Hyperlink"/>
-        </w:rPr>
-        <w:t>g</w:t>
+        <w:t>https://openstax.org</w:t>
       </w:r>
     </w:hyperlink>
   </w:p>
@@ -1203,9 +1191,9 @@
   <w:style w:type="character" w:styleId="Hyperlink">
     <w:name w:val="Hyperlink"/>
     <w:basedOn w:val="CaptionChar"/>
-    <w:rsid w:val="0053563F"/>
-    <w:rPr>
-      <w:color w:val="4F6CBD"/>
+    <w:rsid w:val="00E84B42"/>
+    <w:rPr>
+      <w:color w:val="3F5AA7"/>
     </w:rPr>
   </w:style>
   <w:style w:type="character" w:customStyle="1" w:styleId="HeaderChar">

</xml_diff>

<commit_message>
Update link color to 3F5AA7 (#447)
</commit_message>
<xml_diff>
--- a/bakery-src/scripts/gdoc/custom-reference-en.docx
+++ b/bakery-src/scripts/gdoc/custom-reference-en.docx
@@ -535,19 +535,7 @@
         <w:rPr>
           <w:rStyle w:val="Hyperlink"/>
         </w:rPr>
-        <w:t>https://openstax.o</w:t>
-      </w:r>
-      <w:r>
-        <w:rPr>
-          <w:rStyle w:val="Hyperlink"/>
-        </w:rPr>
-        <w:t>r</w:t>
-      </w:r>
-      <w:r>
-        <w:rPr>
-          <w:rStyle w:val="Hyperlink"/>
-        </w:rPr>
-        <w:t>g</w:t>
+        <w:t>https://openstax.org</w:t>
       </w:r>
     </w:hyperlink>
   </w:p>
@@ -1203,9 +1191,9 @@
   <w:style w:type="character" w:styleId="Hyperlink">
     <w:name w:val="Hyperlink"/>
     <w:basedOn w:val="CaptionChar"/>
-    <w:rsid w:val="0053563F"/>
-    <w:rPr>
-      <w:color w:val="4F6CBD"/>
+    <w:rsid w:val="00E84B42"/>
+    <w:rPr>
+      <w:color w:val="3F5AA7"/>
     </w:rPr>
   </w:style>
   <w:style w:type="character" w:customStyle="1" w:styleId="HeaderChar">

</xml_diff>